<commit_message>
docs: rebuild developer handbook with patient feedback and AI insights details
</commit_message>
<xml_diff>
--- a/documents /St_George_HMS_Development_Report.docx
+++ b/documents /St_George_HMS_Development_Report.docx
@@ -1393,6 +1393,19 @@
         <w:t>Q5: How do we extract or compile data for reporting?</w:t>
       </w:r>
     </w:p>
+    <w:p>
+      <w:pPr>
+        <w:spacing w:before="200" w:after="40"/>
+      </w:pPr>
+      <w:r>
+        <w:rPr>
+          <w:b/>
+          <w:color w:val="0F172A"/>
+          <w:sz w:val="24"/>
+        </w:rPr>
+        <w:t>Q6: How does the system handle Patient Feedback, Sentiment Analysis, and Automated Insights (FR47, FR48)?</w:t>
+      </w:r>
+    </w:p>
     <w:sectPr>
       <w:pgSz w:w="12240" w:h="15840"/>
       <w:pgMar w:top="1440" w:right="1800" w:bottom="1440" w:left="1800" w:header="720" w:footer="720" w:gutter="0"/>

</xml_diff>